<commit_message>
Spanish Part 2: episodes 18-20; rename ep25 bartender (Rolo) to avoid clash with installer Beto
Co-Authored-By: Claude Opus 5.5 <noreply@anthropic.com>
Claude-Session: https://claude.ai/code/session_014Pwa4fJotSRvNewqVrvk7U
</commit_message>
<xml_diff>
--- a/business_es/part2/ep25_Amparo_y_Lucas_a_solas.docx
+++ b/business_es/part2/ep25_Amparo_y_Lucas_a_solas.docx
@@ -180,7 +180,7 @@
                 <w:b w:val="0"/>
                 <w:sz w:val="19"/>
               </w:rPr>
-              <w:t>Lucas Ferrer (수출 책임자) · Amparo Albalat (국내영업 책임자) · Beto (옥상 바 바텐더) · Vicente Albalat (대표, 전화)</w:t>
+              <w:t>Lucas Ferrer (수출 책임자) · Amparo Albalat (국내영업 책임자) · Rolo (옥상 바 바텐더) · Vicente Albalat (대표, 전화)</w:t>
             </w:r>
           </w:p>
         </w:tc>
@@ -303,7 +303,7 @@
                 <w:b w:val="0"/>
                 <w:sz w:val="19"/>
               </w:rPr>
-              <w:t>대화 120턴 (Lucas 49 · Amparo 48 · Beto 18 · Vicente 5) · A2 15% / B1 45% / B2 30% / C1 10% 목표</w:t>
+              <w:t>대화 120턴 (Lucas 49 · Amparo 48 · Rolo 18 · Vicente 5) · A2 15% / B1 45% / B2 30% / C1 10% 목표</w:t>
             </w:r>
           </w:p>
         </w:tc>
@@ -352,7 +352,7 @@
           <w:rFonts w:ascii="Calibri" w:hAnsi="Calibri" w:eastAsia="Malgun Gothic"/>
           <w:sz w:val="20"/>
         </w:rPr>
-        <w:t>목요일 주차장에서의 다툼 이후 이틀. 토요일 밤, 루카스는 호텔 옥상 바에서 암파로를 기다린다. 올지 안 올지 모른다. 바텐더 베토는 몬테레이식 충고를 건넨다. '돌려 말하지 말고 사과하세요.' 세로 데 라 시야를 마주하고, 두 사람은 처음으로 하고 싶은 말을 다 한다. 보고타 일의 진짜 상처, 루카스가 마드리드를 떠난 이유, 그리고 암파로가 공항에서 털어놓았던 아버지의 비밀. 새벽 6시 40분의 온다에서 걸려 온 비센테의 전화가 대화를 한 번 더 흔든다. 월요일 서명 전에 풀어야 할 것은 계약서가 아니었다.</w:t>
+        <w:t>목요일 주차장에서의 다툼 이후 이틀. 토요일 밤, 루카스는 호텔 옥상 바에서 암파로를 기다린다. 올지 안 올지 모른다. 바텐더 롤로는 몬테레이식 충고를 건넨다. '돌려 말하지 말고 사과하세요.' 세로 데 라 시야를 마주하고, 두 사람은 처음으로 하고 싶은 말을 다 한다. 보고타 일의 진짜 상처, 루카스가 마드리드를 떠난 이유, 그리고 암파로가 공항에서 털어놓았던 아버지의 비밀. 새벽 6시 40분의 온다에서 걸려 온 비센테의 전화가 대화를 한 번 더 흔든다. 월요일 서명 전에 풀어야 할 것은 계약서가 아니었다.</w:t>
       </w:r>
     </w:p>
     <w:p>
@@ -470,7 +470,7 @@
           <w:color w:val="2E6B3A"/>
           <w:sz w:val="21"/>
         </w:rPr>
-        <w:t>Beto:</w:t>
+        <w:t>Rolo:</w:t>
       </w:r>
       <w:r>
         <w:rPr>
@@ -522,7 +522,7 @@
           <w:color w:val="2E6B3A"/>
           <w:sz w:val="21"/>
         </w:rPr>
-        <w:t>Beto:</w:t>
+        <w:t>Rolo:</w:t>
       </w:r>
       <w:r>
         <w:rPr>
@@ -574,7 +574,7 @@
           <w:color w:val="2E6B3A"/>
           <w:sz w:val="21"/>
         </w:rPr>
-        <w:t>Beto:</w:t>
+        <w:t>Rolo:</w:t>
       </w:r>
       <w:r>
         <w:rPr>
@@ -626,7 +626,7 @@
           <w:color w:val="2E6B3A"/>
           <w:sz w:val="21"/>
         </w:rPr>
-        <w:t>Beto:</w:t>
+        <w:t>Rolo:</w:t>
       </w:r>
       <w:r>
         <w:rPr>
@@ -678,7 +678,7 @@
           <w:color w:val="2E6B3A"/>
           <w:sz w:val="21"/>
         </w:rPr>
-        <w:t>Beto:</w:t>
+        <w:t>Rolo:</w:t>
       </w:r>
       <w:r>
         <w:rPr>
@@ -730,7 +730,7 @@
           <w:color w:val="2E6B3A"/>
           <w:sz w:val="21"/>
         </w:rPr>
-        <w:t>Beto:</w:t>
+        <w:t>Rolo:</w:t>
       </w:r>
       <w:r>
         <w:rPr>
@@ -849,7 +849,7 @@
           <w:color w:val="2E6B3A"/>
           <w:sz w:val="21"/>
         </w:rPr>
-        <w:t>Beto:</w:t>
+        <w:t>Rolo:</w:t>
       </w:r>
       <w:r>
         <w:rPr>
@@ -901,7 +901,7 @@
           <w:color w:val="2E6B3A"/>
           <w:sz w:val="21"/>
         </w:rPr>
-        <w:t>Beto:</w:t>
+        <w:t>Rolo:</w:t>
       </w:r>
       <w:r>
         <w:rPr>
@@ -924,7 +924,7 @@
           <w:color w:val="666666"/>
           <w:sz w:val="19"/>
         </w:rPr>
-        <w:t>Beto se aleja. Silencio.</w:t>
+        <w:t>Rolo se aleja. Silencio.</w:t>
       </w:r>
     </w:p>
     <w:p>
@@ -1358,7 +1358,7 @@
           <w:color w:val="2E6B3A"/>
           <w:sz w:val="21"/>
         </w:rPr>
-        <w:t>Beto:</w:t>
+        <w:t>Rolo:</w:t>
       </w:r>
       <w:r>
         <w:rPr>
@@ -1410,7 +1410,7 @@
           <w:color w:val="2E6B3A"/>
           <w:sz w:val="21"/>
         </w:rPr>
-        <w:t>Beto:</w:t>
+        <w:t>Rolo:</w:t>
       </w:r>
       <w:r>
         <w:rPr>
@@ -2061,7 +2061,7 @@
           <w:color w:val="666666"/>
           <w:sz w:val="19"/>
         </w:rPr>
-        <w:t>En la otra punta de la azotea, un grupo de ejecutivos celebra algo. Beto pone música norteña muy bajita. Vibra el móvil de Amparo. En la pantalla: «Papá».</w:t>
+        <w:t>En la otra punta de la azotea, un grupo de ejecutivos celebra algo. Rolo pone música norteña muy bajita. Vibra el móvil de Amparo. En la pantalla: «Papá».</w:t>
       </w:r>
     </w:p>
     <w:p>
@@ -2588,7 +2588,7 @@
           <w:color w:val="2E6B3A"/>
           <w:sz w:val="21"/>
         </w:rPr>
-        <w:t>Beto:</w:t>
+        <w:t>Rolo:</w:t>
       </w:r>
       <w:r>
         <w:rPr>
@@ -2622,7 +2622,7 @@
           <w:sz w:val="22"/>
         </w:rPr>
         <w:tab/>
-        <w:t>(sonríe) Casi, Beto. Estamos negociando.</w:t>
+        <w:t>(sonríe) Casi, Rolo. Estamos negociando.</w:t>
       </w:r>
     </w:p>
     <w:p>
@@ -2640,7 +2640,7 @@
           <w:color w:val="2E6B3A"/>
           <w:sz w:val="21"/>
         </w:rPr>
-        <w:t>Beto:</w:t>
+        <w:t>Rolo:</w:t>
       </w:r>
       <w:r>
         <w:rPr>
@@ -2692,7 +2692,7 @@
           <w:color w:val="2E6B3A"/>
           <w:sz w:val="21"/>
         </w:rPr>
-        <w:t>Beto:</w:t>
+        <w:t>Rolo:</w:t>
       </w:r>
       <w:r>
         <w:rPr>
@@ -2744,7 +2744,7 @@
           <w:color w:val="2E6B3A"/>
           <w:sz w:val="21"/>
         </w:rPr>
-        <w:t>Beto:</w:t>
+        <w:t>Rolo:</w:t>
       </w:r>
       <w:r>
         <w:rPr>
@@ -2767,7 +2767,7 @@
           <w:color w:val="666666"/>
           <w:sz w:val="19"/>
         </w:rPr>
-        <w:t>Beto sirve dos copitas, con rodajas de naranja y un platito de sal rojiza.</w:t>
+        <w:t>Rolo sirve dos copitas, con rodajas de naranja y un platito de sal rojiza.</w:t>
       </w:r>
     </w:p>
     <w:p>
@@ -2811,7 +2811,7 @@
           <w:color w:val="2E6B3A"/>
           <w:sz w:val="21"/>
         </w:rPr>
-        <w:t>Beto:</w:t>
+        <w:t>Rolo:</w:t>
       </w:r>
       <w:r>
         <w:rPr>
@@ -2979,7 +2979,7 @@
           <w:color w:val="666666"/>
           <w:sz w:val="19"/>
         </w:rPr>
-        <w:t>Los ejecutivos se han ido. Beto recoge vasos. Sobre la barra, el borrador del contrato con los comentarios en rojo de Ramón, que Amparo ha sacado del bolso.</w:t>
+        <w:t>Los ejecutivos se han ido. Rolo recoge vasos. Sobre la barra, el borrador del contrato con los comentarios en rojo de Ramón, que Amparo ha sacado del bolso.</w:t>
       </w:r>
     </w:p>
     <w:p>
@@ -3439,7 +3439,7 @@
           <w:color w:val="2E6B3A"/>
           <w:sz w:val="21"/>
         </w:rPr>
-        <w:t>Beto:</w:t>
+        <w:t>Rolo:</w:t>
       </w:r>
       <w:r>
         <w:rPr>
@@ -3595,7 +3595,7 @@
           <w:color w:val="2E6B3A"/>
           <w:sz w:val="21"/>
         </w:rPr>
-        <w:t>Beto:</w:t>
+        <w:t>Rolo:</w:t>
       </w:r>
       <w:r>
         <w:rPr>
@@ -3647,7 +3647,7 @@
           <w:color w:val="2E6B3A"/>
           <w:sz w:val="21"/>
         </w:rPr>
-        <w:t>Beto:</w:t>
+        <w:t>Rolo:</w:t>
       </w:r>
       <w:r>
         <w:rPr>
@@ -3681,7 +3681,7 @@
           <w:sz w:val="22"/>
         </w:rPr>
         <w:tab/>
-        <w:t>Gracias, Beto. Buenas noches.</w:t>
+        <w:t>Gracias, Rolo. Buenas noches.</w:t>
       </w:r>
     </w:p>
     <w:p>
@@ -3756,7 +3756,7 @@
           <w:color w:val="666666"/>
           <w:sz w:val="18"/>
         </w:rPr>
-        <w:t>옥상 바의 바텐더 베토는 몬테레이 토박이입니다. 밤의 구어 표현을 비교해 봅시다.</w:t>
+        <w:t>옥상 바의 바텐더 롤로는 몬테레이 토박이입니다. 밤의 구어 표현을 비교해 봅시다.</w:t>
       </w:r>
     </w:p>
     <w:tbl>
@@ -7361,7 +7361,7 @@
           <w:color w:val="2E6B3A"/>
           <w:sz w:val="21"/>
         </w:rPr>
-        <w:t>Beto:</w:t>
+        <w:t>Rolo:</w:t>
       </w:r>
       <w:r>
         <w:rPr>
@@ -7413,7 +7413,7 @@
           <w:color w:val="2E6B3A"/>
           <w:sz w:val="21"/>
         </w:rPr>
-        <w:t>Beto:</w:t>
+        <w:t>Rolo:</w:t>
       </w:r>
       <w:r>
         <w:rPr>
@@ -7465,7 +7465,7 @@
           <w:color w:val="2E6B3A"/>
           <w:sz w:val="21"/>
         </w:rPr>
-        <w:t>Beto:</w:t>
+        <w:t>Rolo:</w:t>
       </w:r>
       <w:r>
         <w:rPr>
@@ -7517,7 +7517,7 @@
           <w:color w:val="2E6B3A"/>
           <w:sz w:val="21"/>
         </w:rPr>
-        <w:t>Beto:</w:t>
+        <w:t>Rolo:</w:t>
       </w:r>
       <w:r>
         <w:rPr>
@@ -7569,7 +7569,7 @@
           <w:color w:val="2E6B3A"/>
           <w:sz w:val="21"/>
         </w:rPr>
-        <w:t>Beto:</w:t>
+        <w:t>Rolo:</w:t>
       </w:r>
       <w:r>
         <w:rPr>
@@ -7621,7 +7621,7 @@
           <w:color w:val="2E6B3A"/>
           <w:sz w:val="21"/>
         </w:rPr>
-        <w:t>Beto:</w:t>
+        <w:t>Rolo:</w:t>
       </w:r>
       <w:r>
         <w:rPr>
@@ -7740,7 +7740,7 @@
           <w:color w:val="2E6B3A"/>
           <w:sz w:val="21"/>
         </w:rPr>
-        <w:t>Beto:</w:t>
+        <w:t>Rolo:</w:t>
       </w:r>
       <w:r>
         <w:rPr>
@@ -7792,7 +7792,7 @@
           <w:color w:val="2E6B3A"/>
           <w:sz w:val="21"/>
         </w:rPr>
-        <w:t>Beto:</w:t>
+        <w:t>Rolo:</w:t>
       </w:r>
       <w:r>
         <w:rPr>
@@ -7815,7 +7815,7 @@
           <w:color w:val="666666"/>
           <w:sz w:val="19"/>
         </w:rPr>
-        <w:t>베토가 자리를 뜬다. 침묵.</w:t>
+        <w:t>롤로가 자리를 뜬다. 침묵.</w:t>
       </w:r>
     </w:p>
     <w:p>
@@ -8249,7 +8249,7 @@
           <w:color w:val="2E6B3A"/>
           <w:sz w:val="21"/>
         </w:rPr>
-        <w:t>Beto:</w:t>
+        <w:t>Rolo:</w:t>
       </w:r>
       <w:r>
         <w:rPr>
@@ -8301,7 +8301,7 @@
           <w:color w:val="2E6B3A"/>
           <w:sz w:val="21"/>
         </w:rPr>
-        <w:t>Beto:</w:t>
+        <w:t>Rolo:</w:t>
       </w:r>
       <w:r>
         <w:rPr>
@@ -8953,7 +8953,7 @@
           <w:color w:val="666666"/>
           <w:sz w:val="19"/>
         </w:rPr>
-        <w:t>옥상 반대편 끝에서 한 무리의 직장인들이 뭔가를 축하하고 있다. 베토가 노르테냐 음악을 아주 작게 튼다. 암파로의 휴대폰이 진동한다. 화면에 '아빠'.</w:t>
+        <w:t>옥상 반대편 끝에서 한 무리의 직장인들이 뭔가를 축하하고 있다. 롤로가 노르테냐 음악을 아주 작게 튼다. 암파로의 휴대폰이 진동한다. 화면에 '아빠'.</w:t>
       </w:r>
     </w:p>
     <w:p>
@@ -9480,7 +9480,7 @@
           <w:color w:val="2E6B3A"/>
           <w:sz w:val="21"/>
         </w:rPr>
-        <w:t>Beto:</w:t>
+        <w:t>Rolo:</w:t>
       </w:r>
       <w:r>
         <w:rPr>
@@ -9514,7 +9514,7 @@
           <w:sz w:val="21"/>
         </w:rPr>
         <w:tab/>
-        <w:t>(미소 지으며) 거의요, 베토. 협상 중이에요.</w:t>
+        <w:t>(미소 지으며) 거의요, 롤로. 협상 중이에요.</w:t>
       </w:r>
     </w:p>
     <w:p>
@@ -9532,7 +9532,7 @@
           <w:color w:val="2E6B3A"/>
           <w:sz w:val="21"/>
         </w:rPr>
-        <w:t>Beto:</w:t>
+        <w:t>Rolo:</w:t>
       </w:r>
       <w:r>
         <w:rPr>
@@ -9584,7 +9584,7 @@
           <w:color w:val="2E6B3A"/>
           <w:sz w:val="21"/>
         </w:rPr>
-        <w:t>Beto:</w:t>
+        <w:t>Rolo:</w:t>
       </w:r>
       <w:r>
         <w:rPr>
@@ -9636,7 +9636,7 @@
           <w:color w:val="2E6B3A"/>
           <w:sz w:val="21"/>
         </w:rPr>
-        <w:t>Beto:</w:t>
+        <w:t>Rolo:</w:t>
       </w:r>
       <w:r>
         <w:rPr>
@@ -9659,7 +9659,7 @@
           <w:color w:val="666666"/>
           <w:sz w:val="19"/>
         </w:rPr>
-        <w:t>베토가 오렌지 조각과 붉은 소금 한 접시를 곁들여 작은 잔 두 개를 내놓는다.</w:t>
+        <w:t>롤로가 오렌지 조각과 붉은 소금 한 접시를 곁들여 작은 잔 두 개를 내놓는다.</w:t>
       </w:r>
     </w:p>
     <w:p>
@@ -9703,7 +9703,7 @@
           <w:color w:val="2E6B3A"/>
           <w:sz w:val="21"/>
         </w:rPr>
-        <w:t>Beto:</w:t>
+        <w:t>Rolo:</w:t>
       </w:r>
       <w:r>
         <w:rPr>
@@ -9872,7 +9872,7 @@
           <w:color w:val="666666"/>
           <w:sz w:val="19"/>
         </w:rPr>
-        <w:t>직장인들은 떠났다. 베토가 잔을 치운다. 바 위에는 암파로가 가방에서 꺼낸 계약서 초안이 놓여 있다. 라몬의 빨간 메모가 가득하다.</w:t>
+        <w:t>직장인들은 떠났다. 롤로가 잔을 치운다. 바 위에는 암파로가 가방에서 꺼낸 계약서 초안이 놓여 있다. 라몬의 빨간 메모가 가득하다.</w:t>
       </w:r>
     </w:p>
     <w:p>
@@ -10332,7 +10332,7 @@
           <w:color w:val="2E6B3A"/>
           <w:sz w:val="21"/>
         </w:rPr>
-        <w:t>Beto:</w:t>
+        <w:t>Rolo:</w:t>
       </w:r>
       <w:r>
         <w:rPr>
@@ -10488,7 +10488,7 @@
           <w:color w:val="2E6B3A"/>
           <w:sz w:val="21"/>
         </w:rPr>
-        <w:t>Beto:</w:t>
+        <w:t>Rolo:</w:t>
       </w:r>
       <w:r>
         <w:rPr>
@@ -10540,7 +10540,7 @@
           <w:color w:val="2E6B3A"/>
           <w:sz w:val="21"/>
         </w:rPr>
-        <w:t>Beto:</w:t>
+        <w:t>Rolo:</w:t>
       </w:r>
       <w:r>
         <w:rPr>
@@ -10574,7 +10574,7 @@
           <w:sz w:val="21"/>
         </w:rPr>
         <w:tab/>
-        <w:t>고마워요, 베토. 안녕히 주무세요.</w:t>
+        <w:t>고마워요, 롤로. 안녕히 주무세요.</w:t>
       </w:r>
     </w:p>
     <w:p>

</xml_diff>